<commit_message>
Add total candidates to Table 1
</commit_message>
<xml_diff>
--- a/Table 1 - missing.docx
+++ b/Table 1 - missing.docx
@@ -4,7 +4,27 @@
   <w:body>
     <w:p>
       <w:r>
-        <w:t>Table 1: Candidate characteristics, by training and test data split. The discrete-time dataset uses a unit of 1 week, and candidates can contribute multiple weeks from listing to removal. The training set included all weeks from 1/1/2019 through 12/31/2022, for candidates listed by 11/15/2022. The test set included all weeks from 1/1/2023 through 12/31/2023, for candidates listed by 11/15/2023. Out-of-range values were recoded as missing, and non-missing values were carried forward.</w:t>
+        <w:t xml:space="preserve">Table 1: Candidate characteristics, by training and test data split. The discrete-time dataset </w:t>
+      </w:r>
+      <w:r>
+        <w:t>ha</w:t>
+      </w:r>
+      <w:r>
+        <w:t>d</w:t>
+      </w:r>
+      <w:r>
+        <w:t xml:space="preserve"> a unit of 1 week, and candidates </w:t>
+      </w:r>
+      <w:r>
+        <w:t>could</w:t>
+      </w:r>
+      <w:r>
+        <w:t xml:space="preserve"> contribute multiple weeks from listing to removal. The training set included all weeks from 1/1/2019 throu</w:t>
+      </w:r>
+      <w:bookmarkStart w:id="0" w:name="_GoBack"/>
+      <w:bookmarkEnd w:id="0"/>
+      <w:r>
+        <w:t>gh 12/31/2022, for candidates listed by 11/15/2022. The test set included all weeks from 1/1/2023 through 12/31/2023, for candidates listed by 11/15/2023. Out-of-range values were recoded as missing, and non-missing values were carried forward.</w:t>
       </w:r>
     </w:p>
     <w:tbl>
@@ -292,32 +312,9 @@
                 <w:sz w:val="20"/>
                 <w:szCs w:val="20"/>
               </w:rPr>
-              <w:t>Number of rows per candidate</w:t>
-            </w:r>
-          </w:p>
-        </w:tc>
-        <w:tc>
-          <w:tcPr>
-            <w:tcW w:w="0" w:type="auto"/>
-            <w:tcBorders>
-              <w:top w:val="nil"/>
-              <w:left w:val="nil"/>
-              <w:bottom w:val="nil"/>
-              <w:right w:val="nil"/>
-            </w:tcBorders>
-            <w:shd w:val="clear" w:color="auto" w:fill="FFFFFF"/>
-            <w:noWrap/>
-            <w:tcMar>
-              <w:top w:w="60" w:type="dxa"/>
-              <w:left w:w="180" w:type="dxa"/>
-              <w:bottom w:w="60" w:type="dxa"/>
-              <w:right w:w="180" w:type="dxa"/>
-            </w:tcMar>
-            <w:vAlign w:val="center"/>
-          </w:tcPr>
-          <w:p>
-            <w:pPr>
-              <w:spacing w:after="0" w:line="240" w:lineRule="auto"/>
+              <w:t>Total candidates</w:t>
+            </w:r>
+            <w:r>
               <w:rPr>
                 <w:rFonts w:ascii="Arial" w:eastAsia="Times New Roman" w:hAnsi="Arial" w:cs="Arial"/>
                 <w:b/>
@@ -325,6 +322,42 @@
                 <w:color w:val="000000"/>
                 <w:sz w:val="20"/>
                 <w:szCs w:val="20"/>
+                <w:vertAlign w:val="superscript"/>
+              </w:rPr>
+              <w:t>1</w:t>
+            </w:r>
+          </w:p>
+        </w:tc>
+        <w:tc>
+          <w:tcPr>
+            <w:tcW w:w="0" w:type="auto"/>
+            <w:tcBorders>
+              <w:top w:val="nil"/>
+              <w:left w:val="nil"/>
+              <w:bottom w:val="nil"/>
+              <w:right w:val="nil"/>
+            </w:tcBorders>
+            <w:shd w:val="clear" w:color="auto" w:fill="FFFFFF"/>
+            <w:noWrap/>
+            <w:tcMar>
+              <w:top w:w="60" w:type="dxa"/>
+              <w:left w:w="180" w:type="dxa"/>
+              <w:bottom w:w="60" w:type="dxa"/>
+              <w:right w:w="180" w:type="dxa"/>
+            </w:tcMar>
+            <w:vAlign w:val="center"/>
+          </w:tcPr>
+          <w:p>
+            <w:pPr>
+              <w:spacing w:after="0" w:line="240" w:lineRule="auto"/>
+              <w:jc w:val="center"/>
+              <w:rPr>
+                <w:rFonts w:ascii="Arial" w:eastAsia="Times New Roman" w:hAnsi="Arial" w:cs="Arial"/>
+                <w:b/>
+                <w:bCs/>
+                <w:color w:val="000000"/>
+                <w:sz w:val="20"/>
+                <w:szCs w:val="20"/>
               </w:rPr>
             </w:pPr>
           </w:p>
@@ -417,56 +450,6 @@
               <w:spacing w:after="0" w:line="240" w:lineRule="auto"/>
               <w:rPr>
                 <w:rFonts w:ascii="Arial" w:eastAsia="Times New Roman" w:hAnsi="Arial" w:cs="Arial"/>
-                <w:color w:val="000000"/>
-                <w:sz w:val="20"/>
-                <w:szCs w:val="20"/>
-              </w:rPr>
-            </w:pPr>
-            <w:r>
-              <w:rPr>
-                <w:rFonts w:ascii="Arial" w:eastAsia="Times New Roman" w:hAnsi="Arial" w:cs="Arial"/>
-                <w:color w:val="000000"/>
-                <w:sz w:val="20"/>
-                <w:szCs w:val="20"/>
-              </w:rPr>
-              <w:t xml:space="preserve">    </w:t>
-            </w:r>
-            <w:r>
-              <w:rPr>
-                <w:rFonts w:ascii="Arial" w:eastAsia="Times New Roman" w:hAnsi="Arial" w:cs="Arial"/>
-                <w:color w:val="000000"/>
-                <w:sz w:val="20"/>
-                <w:szCs w:val="20"/>
-              </w:rPr>
-              <w:t>Mean (SD)</w:t>
-            </w:r>
-          </w:p>
-        </w:tc>
-        <w:tc>
-          <w:tcPr>
-            <w:tcW w:w="0" w:type="auto"/>
-            <w:tcBorders>
-              <w:top w:val="nil"/>
-              <w:left w:val="nil"/>
-              <w:bottom w:val="nil"/>
-              <w:right w:val="nil"/>
-            </w:tcBorders>
-            <w:shd w:val="clear" w:color="auto" w:fill="FFFFFF"/>
-            <w:noWrap/>
-            <w:tcMar>
-              <w:top w:w="60" w:type="dxa"/>
-              <w:left w:w="180" w:type="dxa"/>
-              <w:bottom w:w="60" w:type="dxa"/>
-              <w:right w:w="180" w:type="dxa"/>
-            </w:tcMar>
-            <w:vAlign w:val="center"/>
-          </w:tcPr>
-          <w:p>
-            <w:pPr>
-              <w:spacing w:after="0" w:line="240" w:lineRule="auto"/>
-              <w:jc w:val="center"/>
-              <w:rPr>
-                <w:rFonts w:ascii="Arial" w:eastAsia="Times New Roman" w:hAnsi="Arial" w:cs="Arial"/>
                 <w:bCs/>
                 <w:color w:val="000000"/>
                 <w:sz w:val="20"/>
@@ -481,85 +464,156 @@
                 <w:sz w:val="20"/>
                 <w:szCs w:val="20"/>
               </w:rPr>
-              <w:t>38.1 (16.5)</w:t>
-            </w:r>
-          </w:p>
-        </w:tc>
-        <w:tc>
-          <w:tcPr>
-            <w:tcW w:w="0" w:type="auto"/>
-            <w:tcBorders>
-              <w:top w:val="nil"/>
-              <w:left w:val="nil"/>
-              <w:bottom w:val="nil"/>
-              <w:right w:val="nil"/>
-            </w:tcBorders>
-            <w:shd w:val="clear" w:color="auto" w:fill="FFFFFF"/>
-            <w:noWrap/>
-            <w:tcMar>
-              <w:top w:w="60" w:type="dxa"/>
-              <w:left w:w="180" w:type="dxa"/>
-              <w:bottom w:w="60" w:type="dxa"/>
-              <w:right w:w="180" w:type="dxa"/>
-            </w:tcMar>
-            <w:vAlign w:val="center"/>
-          </w:tcPr>
-          <w:p>
-            <w:pPr>
-              <w:spacing w:after="0" w:line="240" w:lineRule="auto"/>
-              <w:jc w:val="center"/>
-              <w:rPr>
-                <w:rFonts w:ascii="Arial" w:eastAsia="Times New Roman" w:hAnsi="Arial" w:cs="Arial"/>
-                <w:sz w:val="20"/>
-                <w:szCs w:val="20"/>
-              </w:rPr>
-            </w:pPr>
-            <w:r>
-              <w:rPr>
-                <w:rFonts w:ascii="Arial" w:eastAsia="Times New Roman" w:hAnsi="Arial" w:cs="Arial"/>
-                <w:sz w:val="20"/>
-                <w:szCs w:val="20"/>
-              </w:rPr>
-              <w:t>102.3 (64.0)</w:t>
-            </w:r>
-          </w:p>
-        </w:tc>
-        <w:tc>
-          <w:tcPr>
-            <w:tcW w:w="0" w:type="auto"/>
-            <w:tcBorders>
-              <w:top w:val="nil"/>
-              <w:left w:val="nil"/>
-              <w:bottom w:val="nil"/>
-              <w:right w:val="nil"/>
-            </w:tcBorders>
-            <w:shd w:val="clear" w:color="auto" w:fill="FFFFFF"/>
-            <w:noWrap/>
-            <w:tcMar>
-              <w:top w:w="60" w:type="dxa"/>
-              <w:left w:w="180" w:type="dxa"/>
-              <w:bottom w:w="60" w:type="dxa"/>
-              <w:right w:w="180" w:type="dxa"/>
-            </w:tcMar>
-            <w:vAlign w:val="center"/>
-          </w:tcPr>
-          <w:p>
-            <w:pPr>
-              <w:spacing w:after="0" w:line="240" w:lineRule="auto"/>
-              <w:jc w:val="center"/>
-              <w:rPr>
-                <w:rFonts w:ascii="Arial" w:eastAsia="Times New Roman" w:hAnsi="Arial" w:cs="Arial"/>
-                <w:sz w:val="20"/>
-                <w:szCs w:val="20"/>
-              </w:rPr>
-            </w:pPr>
-            <w:r>
-              <w:rPr>
-                <w:rFonts w:ascii="Arial" w:eastAsia="Times New Roman" w:hAnsi="Arial" w:cs="Arial"/>
-                <w:sz w:val="20"/>
-                <w:szCs w:val="20"/>
-              </w:rPr>
-              <w:t>110.7 (74.6)</w:t>
+              <w:t xml:space="preserve">    N</w:t>
+            </w:r>
+            <w:r>
+              <w:rPr>
+                <w:rFonts w:ascii="Arial" w:eastAsia="Times New Roman" w:hAnsi="Arial" w:cs="Arial"/>
+                <w:bCs/>
+                <w:color w:val="000000"/>
+                <w:sz w:val="20"/>
+                <w:szCs w:val="20"/>
+              </w:rPr>
+              <w:t xml:space="preserve"> (%)</w:t>
+            </w:r>
+          </w:p>
+        </w:tc>
+        <w:tc>
+          <w:tcPr>
+            <w:tcW w:w="0" w:type="auto"/>
+            <w:tcBorders>
+              <w:top w:val="nil"/>
+              <w:left w:val="nil"/>
+              <w:bottom w:val="nil"/>
+              <w:right w:val="nil"/>
+            </w:tcBorders>
+            <w:shd w:val="clear" w:color="auto" w:fill="FFFFFF"/>
+            <w:noWrap/>
+            <w:tcMar>
+              <w:top w:w="60" w:type="dxa"/>
+              <w:left w:w="180" w:type="dxa"/>
+              <w:bottom w:w="60" w:type="dxa"/>
+              <w:right w:w="180" w:type="dxa"/>
+            </w:tcMar>
+            <w:vAlign w:val="center"/>
+          </w:tcPr>
+          <w:p>
+            <w:pPr>
+              <w:spacing w:after="0" w:line="240" w:lineRule="auto"/>
+              <w:jc w:val="center"/>
+              <w:rPr>
+                <w:rFonts w:ascii="Arial" w:eastAsia="Times New Roman" w:hAnsi="Arial" w:cs="Arial"/>
+                <w:bCs/>
+                <w:color w:val="000000"/>
+                <w:sz w:val="20"/>
+                <w:szCs w:val="20"/>
+              </w:rPr>
+            </w:pPr>
+            <w:r>
+              <w:rPr>
+                <w:rFonts w:ascii="Arial" w:eastAsia="Times New Roman" w:hAnsi="Arial" w:cs="Arial"/>
+                <w:bCs/>
+                <w:color w:val="000000"/>
+                <w:sz w:val="20"/>
+                <w:szCs w:val="20"/>
+              </w:rPr>
+              <w:t>7568</w:t>
+            </w:r>
+            <w:r>
+              <w:rPr>
+                <w:rFonts w:ascii="Arial" w:eastAsia="Times New Roman" w:hAnsi="Arial" w:cs="Arial"/>
+                <w:bCs/>
+                <w:color w:val="000000"/>
+                <w:sz w:val="20"/>
+                <w:szCs w:val="20"/>
+              </w:rPr>
+              <w:t xml:space="preserve"> (30.5%)</w:t>
+            </w:r>
+          </w:p>
+        </w:tc>
+        <w:tc>
+          <w:tcPr>
+            <w:tcW w:w="0" w:type="auto"/>
+            <w:tcBorders>
+              <w:top w:val="nil"/>
+              <w:left w:val="nil"/>
+              <w:bottom w:val="nil"/>
+              <w:right w:val="nil"/>
+            </w:tcBorders>
+            <w:shd w:val="clear" w:color="auto" w:fill="FFFFFF"/>
+            <w:noWrap/>
+            <w:tcMar>
+              <w:top w:w="60" w:type="dxa"/>
+              <w:left w:w="180" w:type="dxa"/>
+              <w:bottom w:w="60" w:type="dxa"/>
+              <w:right w:w="180" w:type="dxa"/>
+            </w:tcMar>
+            <w:vAlign w:val="center"/>
+          </w:tcPr>
+          <w:p>
+            <w:pPr>
+              <w:spacing w:after="0" w:line="240" w:lineRule="auto"/>
+              <w:jc w:val="center"/>
+              <w:rPr>
+                <w:rFonts w:ascii="Arial" w:eastAsia="Times New Roman" w:hAnsi="Arial" w:cs="Arial"/>
+                <w:sz w:val="20"/>
+                <w:szCs w:val="20"/>
+              </w:rPr>
+            </w:pPr>
+            <w:r>
+              <w:rPr>
+                <w:rFonts w:ascii="Arial" w:eastAsia="Times New Roman" w:hAnsi="Arial" w:cs="Arial"/>
+                <w:sz w:val="20"/>
+                <w:szCs w:val="20"/>
+              </w:rPr>
+              <w:t>19747</w:t>
+            </w:r>
+            <w:r>
+              <w:rPr>
+                <w:rFonts w:ascii="Arial" w:eastAsia="Times New Roman" w:hAnsi="Arial" w:cs="Arial"/>
+                <w:sz w:val="20"/>
+                <w:szCs w:val="20"/>
+              </w:rPr>
+              <w:t xml:space="preserve"> (79.5%)</w:t>
+            </w:r>
+          </w:p>
+        </w:tc>
+        <w:tc>
+          <w:tcPr>
+            <w:tcW w:w="0" w:type="auto"/>
+            <w:tcBorders>
+              <w:top w:val="nil"/>
+              <w:left w:val="nil"/>
+              <w:bottom w:val="nil"/>
+              <w:right w:val="nil"/>
+            </w:tcBorders>
+            <w:shd w:val="clear" w:color="auto" w:fill="FFFFFF"/>
+            <w:noWrap/>
+            <w:tcMar>
+              <w:top w:w="60" w:type="dxa"/>
+              <w:left w:w="180" w:type="dxa"/>
+              <w:bottom w:w="60" w:type="dxa"/>
+              <w:right w:w="180" w:type="dxa"/>
+            </w:tcMar>
+            <w:vAlign w:val="center"/>
+          </w:tcPr>
+          <w:p>
+            <w:pPr>
+              <w:spacing w:after="0" w:line="240" w:lineRule="auto"/>
+              <w:jc w:val="center"/>
+              <w:rPr>
+                <w:rFonts w:ascii="Arial" w:eastAsia="Times New Roman" w:hAnsi="Arial" w:cs="Arial"/>
+                <w:sz w:val="20"/>
+                <w:szCs w:val="20"/>
+              </w:rPr>
+            </w:pPr>
+            <w:r>
+              <w:rPr>
+                <w:rFonts w:ascii="Arial" w:eastAsia="Times New Roman" w:hAnsi="Arial" w:cs="Arial"/>
+                <w:sz w:val="20"/>
+                <w:szCs w:val="20"/>
+              </w:rPr>
+              <w:t>24852</w:t>
             </w:r>
           </w:p>
         </w:tc>
@@ -589,56 +643,7 @@
               <w:spacing w:after="0" w:line="240" w:lineRule="auto"/>
               <w:rPr>
                 <w:rFonts w:ascii="Arial" w:eastAsia="Times New Roman" w:hAnsi="Arial" w:cs="Arial"/>
-                <w:color w:val="000000"/>
-                <w:sz w:val="20"/>
-                <w:szCs w:val="20"/>
-              </w:rPr>
-            </w:pPr>
-            <w:r>
-              <w:rPr>
-                <w:rFonts w:ascii="Arial" w:eastAsia="Times New Roman" w:hAnsi="Arial" w:cs="Arial"/>
-                <w:color w:val="000000"/>
-                <w:sz w:val="20"/>
-                <w:szCs w:val="20"/>
-              </w:rPr>
-              <w:t xml:space="preserve">    </w:t>
-            </w:r>
-            <w:r>
-              <w:rPr>
-                <w:rFonts w:ascii="Arial" w:eastAsia="Times New Roman" w:hAnsi="Arial" w:cs="Arial"/>
-                <w:color w:val="000000"/>
-                <w:sz w:val="20"/>
-                <w:szCs w:val="20"/>
-              </w:rPr>
-              <w:t>Median [Min, Max]</w:t>
-            </w:r>
-          </w:p>
-        </w:tc>
-        <w:tc>
-          <w:tcPr>
-            <w:tcW w:w="0" w:type="auto"/>
-            <w:tcBorders>
-              <w:top w:val="nil"/>
-              <w:left w:val="nil"/>
-              <w:bottom w:val="nil"/>
-              <w:right w:val="nil"/>
-            </w:tcBorders>
-            <w:shd w:val="clear" w:color="auto" w:fill="FFFFFF"/>
-            <w:noWrap/>
-            <w:tcMar>
-              <w:top w:w="60" w:type="dxa"/>
-              <w:left w:w="180" w:type="dxa"/>
-              <w:bottom w:w="60" w:type="dxa"/>
-              <w:right w:w="180" w:type="dxa"/>
-            </w:tcMar>
-            <w:vAlign w:val="center"/>
-          </w:tcPr>
-          <w:p>
-            <w:pPr>
-              <w:spacing w:after="0" w:line="240" w:lineRule="auto"/>
-              <w:jc w:val="center"/>
-              <w:rPr>
-                <w:rFonts w:ascii="Arial" w:eastAsia="Times New Roman" w:hAnsi="Arial" w:cs="Arial"/>
+                <w:b/>
                 <w:bCs/>
                 <w:color w:val="000000"/>
                 <w:sz w:val="20"/>
@@ -648,91 +653,109 @@
             <w:r>
               <w:rPr>
                 <w:rFonts w:ascii="Arial" w:eastAsia="Times New Roman" w:hAnsi="Arial" w:cs="Arial"/>
+                <w:b/>
                 <w:bCs/>
                 <w:color w:val="000000"/>
                 <w:sz w:val="20"/>
                 <w:szCs w:val="20"/>
               </w:rPr>
-              <w:t>47.0 [1.0, 59.0]</w:t>
-            </w:r>
-          </w:p>
-        </w:tc>
-        <w:tc>
-          <w:tcPr>
-            <w:tcW w:w="0" w:type="auto"/>
-            <w:tcBorders>
-              <w:top w:val="nil"/>
-              <w:left w:val="nil"/>
-              <w:bottom w:val="nil"/>
-              <w:right w:val="nil"/>
-            </w:tcBorders>
-            <w:shd w:val="clear" w:color="auto" w:fill="FFFFFF"/>
-            <w:noWrap/>
-            <w:tcMar>
-              <w:top w:w="60" w:type="dxa"/>
-              <w:left w:w="180" w:type="dxa"/>
-              <w:bottom w:w="60" w:type="dxa"/>
-              <w:right w:w="180" w:type="dxa"/>
-            </w:tcMar>
-            <w:vAlign w:val="center"/>
-          </w:tcPr>
-          <w:p>
-            <w:pPr>
-              <w:spacing w:after="0" w:line="240" w:lineRule="auto"/>
-              <w:jc w:val="center"/>
-              <w:rPr>
-                <w:rFonts w:ascii="Arial" w:eastAsia="Times New Roman" w:hAnsi="Arial" w:cs="Arial"/>
-                <w:sz w:val="20"/>
-                <w:szCs w:val="20"/>
-              </w:rPr>
-            </w:pPr>
-            <w:r>
-              <w:rPr>
-                <w:rFonts w:ascii="Arial" w:eastAsia="Times New Roman" w:hAnsi="Arial" w:cs="Arial"/>
-                <w:sz w:val="20"/>
-                <w:szCs w:val="20"/>
-              </w:rPr>
-              <w:t>95.0 [1.0, 209.0]</w:t>
-            </w:r>
-          </w:p>
-        </w:tc>
-        <w:tc>
-          <w:tcPr>
-            <w:tcW w:w="0" w:type="auto"/>
-            <w:tcBorders>
-              <w:top w:val="nil"/>
-              <w:left w:val="nil"/>
-              <w:bottom w:val="nil"/>
-              <w:right w:val="nil"/>
-            </w:tcBorders>
-            <w:shd w:val="clear" w:color="auto" w:fill="FFFFFF"/>
-            <w:noWrap/>
-            <w:tcMar>
-              <w:top w:w="60" w:type="dxa"/>
-              <w:left w:w="180" w:type="dxa"/>
-              <w:bottom w:w="60" w:type="dxa"/>
-              <w:right w:w="180" w:type="dxa"/>
-            </w:tcMar>
-            <w:vAlign w:val="center"/>
-          </w:tcPr>
-          <w:p>
-            <w:pPr>
-              <w:spacing w:after="0" w:line="240" w:lineRule="auto"/>
-              <w:jc w:val="center"/>
-              <w:rPr>
-                <w:rFonts w:ascii="Arial" w:eastAsia="Times New Roman" w:hAnsi="Arial" w:cs="Arial"/>
-                <w:sz w:val="20"/>
-                <w:szCs w:val="20"/>
-              </w:rPr>
-            </w:pPr>
-            <w:r>
-              <w:rPr>
-                <w:rFonts w:ascii="Arial" w:eastAsia="Times New Roman" w:hAnsi="Arial" w:cs="Arial"/>
-                <w:sz w:val="20"/>
-                <w:szCs w:val="20"/>
-              </w:rPr>
-              <w:t>99.0 [1.0, 261.0]</w:t>
-            </w:r>
+              <w:t>Number of rows per candidate</w:t>
+            </w:r>
+          </w:p>
+        </w:tc>
+        <w:tc>
+          <w:tcPr>
+            <w:tcW w:w="0" w:type="auto"/>
+            <w:tcBorders>
+              <w:top w:val="nil"/>
+              <w:left w:val="nil"/>
+              <w:bottom w:val="nil"/>
+              <w:right w:val="nil"/>
+            </w:tcBorders>
+            <w:shd w:val="clear" w:color="auto" w:fill="FFFFFF"/>
+            <w:noWrap/>
+            <w:tcMar>
+              <w:top w:w="60" w:type="dxa"/>
+              <w:left w:w="180" w:type="dxa"/>
+              <w:bottom w:w="60" w:type="dxa"/>
+              <w:right w:w="180" w:type="dxa"/>
+            </w:tcMar>
+            <w:vAlign w:val="center"/>
+          </w:tcPr>
+          <w:p>
+            <w:pPr>
+              <w:spacing w:after="0" w:line="240" w:lineRule="auto"/>
+              <w:rPr>
+                <w:rFonts w:ascii="Arial" w:eastAsia="Times New Roman" w:hAnsi="Arial" w:cs="Arial"/>
+                <w:b/>
+                <w:bCs/>
+                <w:color w:val="000000"/>
+                <w:sz w:val="20"/>
+                <w:szCs w:val="20"/>
+              </w:rPr>
+            </w:pPr>
+          </w:p>
+        </w:tc>
+        <w:tc>
+          <w:tcPr>
+            <w:tcW w:w="0" w:type="auto"/>
+            <w:tcBorders>
+              <w:top w:val="nil"/>
+              <w:left w:val="nil"/>
+              <w:bottom w:val="nil"/>
+              <w:right w:val="nil"/>
+            </w:tcBorders>
+            <w:shd w:val="clear" w:color="auto" w:fill="FFFFFF"/>
+            <w:noWrap/>
+            <w:tcMar>
+              <w:top w:w="60" w:type="dxa"/>
+              <w:left w:w="180" w:type="dxa"/>
+              <w:bottom w:w="60" w:type="dxa"/>
+              <w:right w:w="180" w:type="dxa"/>
+            </w:tcMar>
+            <w:vAlign w:val="center"/>
+          </w:tcPr>
+          <w:p>
+            <w:pPr>
+              <w:spacing w:after="0" w:line="240" w:lineRule="auto"/>
+              <w:jc w:val="center"/>
+              <w:rPr>
+                <w:rFonts w:ascii="Times New Roman" w:eastAsia="Times New Roman" w:hAnsi="Times New Roman" w:cs="Times New Roman"/>
+                <w:sz w:val="20"/>
+                <w:szCs w:val="20"/>
+              </w:rPr>
+            </w:pPr>
+          </w:p>
+        </w:tc>
+        <w:tc>
+          <w:tcPr>
+            <w:tcW w:w="0" w:type="auto"/>
+            <w:tcBorders>
+              <w:top w:val="nil"/>
+              <w:left w:val="nil"/>
+              <w:bottom w:val="nil"/>
+              <w:right w:val="nil"/>
+            </w:tcBorders>
+            <w:shd w:val="clear" w:color="auto" w:fill="FFFFFF"/>
+            <w:noWrap/>
+            <w:tcMar>
+              <w:top w:w="60" w:type="dxa"/>
+              <w:left w:w="180" w:type="dxa"/>
+              <w:bottom w:w="60" w:type="dxa"/>
+              <w:right w:w="180" w:type="dxa"/>
+            </w:tcMar>
+            <w:vAlign w:val="center"/>
+          </w:tcPr>
+          <w:p>
+            <w:pPr>
+              <w:spacing w:after="0" w:line="240" w:lineRule="auto"/>
+              <w:jc w:val="center"/>
+              <w:rPr>
+                <w:rFonts w:ascii="Times New Roman" w:eastAsia="Times New Roman" w:hAnsi="Times New Roman" w:cs="Times New Roman"/>
+                <w:sz w:val="20"/>
+                <w:szCs w:val="20"/>
+              </w:rPr>
+            </w:pPr>
           </w:p>
         </w:tc>
       </w:tr>
@@ -755,6 +778,350 @@
               <w:right w:w="180" w:type="dxa"/>
             </w:tcMar>
             <w:vAlign w:val="center"/>
+          </w:tcPr>
+          <w:p>
+            <w:pPr>
+              <w:spacing w:after="0" w:line="240" w:lineRule="auto"/>
+              <w:rPr>
+                <w:rFonts w:ascii="Arial" w:eastAsia="Times New Roman" w:hAnsi="Arial" w:cs="Arial"/>
+                <w:color w:val="000000"/>
+                <w:sz w:val="20"/>
+                <w:szCs w:val="20"/>
+              </w:rPr>
+            </w:pPr>
+            <w:r>
+              <w:rPr>
+                <w:rFonts w:ascii="Arial" w:eastAsia="Times New Roman" w:hAnsi="Arial" w:cs="Arial"/>
+                <w:color w:val="000000"/>
+                <w:sz w:val="20"/>
+                <w:szCs w:val="20"/>
+              </w:rPr>
+              <w:t xml:space="preserve">    </w:t>
+            </w:r>
+            <w:r>
+              <w:rPr>
+                <w:rFonts w:ascii="Arial" w:eastAsia="Times New Roman" w:hAnsi="Arial" w:cs="Arial"/>
+                <w:color w:val="000000"/>
+                <w:sz w:val="20"/>
+                <w:szCs w:val="20"/>
+              </w:rPr>
+              <w:t>Mean (SD)</w:t>
+            </w:r>
+          </w:p>
+        </w:tc>
+        <w:tc>
+          <w:tcPr>
+            <w:tcW w:w="0" w:type="auto"/>
+            <w:tcBorders>
+              <w:top w:val="nil"/>
+              <w:left w:val="nil"/>
+              <w:bottom w:val="nil"/>
+              <w:right w:val="nil"/>
+            </w:tcBorders>
+            <w:shd w:val="clear" w:color="auto" w:fill="FFFFFF"/>
+            <w:noWrap/>
+            <w:tcMar>
+              <w:top w:w="60" w:type="dxa"/>
+              <w:left w:w="180" w:type="dxa"/>
+              <w:bottom w:w="60" w:type="dxa"/>
+              <w:right w:w="180" w:type="dxa"/>
+            </w:tcMar>
+            <w:vAlign w:val="center"/>
+          </w:tcPr>
+          <w:p>
+            <w:pPr>
+              <w:spacing w:after="0" w:line="240" w:lineRule="auto"/>
+              <w:jc w:val="center"/>
+              <w:rPr>
+                <w:rFonts w:ascii="Arial" w:eastAsia="Times New Roman" w:hAnsi="Arial" w:cs="Arial"/>
+                <w:bCs/>
+                <w:color w:val="000000"/>
+                <w:sz w:val="20"/>
+                <w:szCs w:val="20"/>
+              </w:rPr>
+            </w:pPr>
+            <w:r>
+              <w:rPr>
+                <w:rFonts w:ascii="Arial" w:eastAsia="Times New Roman" w:hAnsi="Arial" w:cs="Arial"/>
+                <w:bCs/>
+                <w:color w:val="000000"/>
+                <w:sz w:val="20"/>
+                <w:szCs w:val="20"/>
+              </w:rPr>
+              <w:t>38.1 (16.5)</w:t>
+            </w:r>
+          </w:p>
+        </w:tc>
+        <w:tc>
+          <w:tcPr>
+            <w:tcW w:w="0" w:type="auto"/>
+            <w:tcBorders>
+              <w:top w:val="nil"/>
+              <w:left w:val="nil"/>
+              <w:bottom w:val="nil"/>
+              <w:right w:val="nil"/>
+            </w:tcBorders>
+            <w:shd w:val="clear" w:color="auto" w:fill="FFFFFF"/>
+            <w:noWrap/>
+            <w:tcMar>
+              <w:top w:w="60" w:type="dxa"/>
+              <w:left w:w="180" w:type="dxa"/>
+              <w:bottom w:w="60" w:type="dxa"/>
+              <w:right w:w="180" w:type="dxa"/>
+            </w:tcMar>
+            <w:vAlign w:val="center"/>
+          </w:tcPr>
+          <w:p>
+            <w:pPr>
+              <w:spacing w:after="0" w:line="240" w:lineRule="auto"/>
+              <w:jc w:val="center"/>
+              <w:rPr>
+                <w:rFonts w:ascii="Arial" w:eastAsia="Times New Roman" w:hAnsi="Arial" w:cs="Arial"/>
+                <w:sz w:val="20"/>
+                <w:szCs w:val="20"/>
+              </w:rPr>
+            </w:pPr>
+            <w:r>
+              <w:rPr>
+                <w:rFonts w:ascii="Arial" w:eastAsia="Times New Roman" w:hAnsi="Arial" w:cs="Arial"/>
+                <w:sz w:val="20"/>
+                <w:szCs w:val="20"/>
+              </w:rPr>
+              <w:t>102.3 (64.0)</w:t>
+            </w:r>
+          </w:p>
+        </w:tc>
+        <w:tc>
+          <w:tcPr>
+            <w:tcW w:w="0" w:type="auto"/>
+            <w:tcBorders>
+              <w:top w:val="nil"/>
+              <w:left w:val="nil"/>
+              <w:bottom w:val="nil"/>
+              <w:right w:val="nil"/>
+            </w:tcBorders>
+            <w:shd w:val="clear" w:color="auto" w:fill="FFFFFF"/>
+            <w:noWrap/>
+            <w:tcMar>
+              <w:top w:w="60" w:type="dxa"/>
+              <w:left w:w="180" w:type="dxa"/>
+              <w:bottom w:w="60" w:type="dxa"/>
+              <w:right w:w="180" w:type="dxa"/>
+            </w:tcMar>
+            <w:vAlign w:val="center"/>
+          </w:tcPr>
+          <w:p>
+            <w:pPr>
+              <w:spacing w:after="0" w:line="240" w:lineRule="auto"/>
+              <w:jc w:val="center"/>
+              <w:rPr>
+                <w:rFonts w:ascii="Arial" w:eastAsia="Times New Roman" w:hAnsi="Arial" w:cs="Arial"/>
+                <w:sz w:val="20"/>
+                <w:szCs w:val="20"/>
+              </w:rPr>
+            </w:pPr>
+            <w:r>
+              <w:rPr>
+                <w:rFonts w:ascii="Arial" w:eastAsia="Times New Roman" w:hAnsi="Arial" w:cs="Arial"/>
+                <w:sz w:val="20"/>
+                <w:szCs w:val="20"/>
+              </w:rPr>
+              <w:t>110.7 (74.6)</w:t>
+            </w:r>
+          </w:p>
+        </w:tc>
+      </w:tr>
+      <w:tr>
+        <w:tc>
+          <w:tcPr>
+            <w:tcW w:w="0" w:type="auto"/>
+            <w:tcBorders>
+              <w:top w:val="nil"/>
+              <w:left w:val="nil"/>
+              <w:bottom w:val="nil"/>
+              <w:right w:val="nil"/>
+            </w:tcBorders>
+            <w:shd w:val="clear" w:color="auto" w:fill="FFFFFF"/>
+            <w:noWrap/>
+            <w:tcMar>
+              <w:top w:w="60" w:type="dxa"/>
+              <w:left w:w="60" w:type="dxa"/>
+              <w:bottom w:w="60" w:type="dxa"/>
+              <w:right w:w="180" w:type="dxa"/>
+            </w:tcMar>
+            <w:vAlign w:val="center"/>
+          </w:tcPr>
+          <w:p>
+            <w:pPr>
+              <w:spacing w:after="0" w:line="240" w:lineRule="auto"/>
+              <w:rPr>
+                <w:rFonts w:ascii="Arial" w:eastAsia="Times New Roman" w:hAnsi="Arial" w:cs="Arial"/>
+                <w:color w:val="000000"/>
+                <w:sz w:val="20"/>
+                <w:szCs w:val="20"/>
+              </w:rPr>
+            </w:pPr>
+            <w:r>
+              <w:rPr>
+                <w:rFonts w:ascii="Arial" w:eastAsia="Times New Roman" w:hAnsi="Arial" w:cs="Arial"/>
+                <w:color w:val="000000"/>
+                <w:sz w:val="20"/>
+                <w:szCs w:val="20"/>
+              </w:rPr>
+              <w:t xml:space="preserve">    </w:t>
+            </w:r>
+            <w:r>
+              <w:rPr>
+                <w:rFonts w:ascii="Arial" w:eastAsia="Times New Roman" w:hAnsi="Arial" w:cs="Arial"/>
+                <w:color w:val="000000"/>
+                <w:sz w:val="20"/>
+                <w:szCs w:val="20"/>
+              </w:rPr>
+              <w:t>Median [Min, Max]</w:t>
+            </w:r>
+          </w:p>
+        </w:tc>
+        <w:tc>
+          <w:tcPr>
+            <w:tcW w:w="0" w:type="auto"/>
+            <w:tcBorders>
+              <w:top w:val="nil"/>
+              <w:left w:val="nil"/>
+              <w:bottom w:val="nil"/>
+              <w:right w:val="nil"/>
+            </w:tcBorders>
+            <w:shd w:val="clear" w:color="auto" w:fill="FFFFFF"/>
+            <w:noWrap/>
+            <w:tcMar>
+              <w:top w:w="60" w:type="dxa"/>
+              <w:left w:w="180" w:type="dxa"/>
+              <w:bottom w:w="60" w:type="dxa"/>
+              <w:right w:w="180" w:type="dxa"/>
+            </w:tcMar>
+            <w:vAlign w:val="center"/>
+          </w:tcPr>
+          <w:p>
+            <w:pPr>
+              <w:spacing w:after="0" w:line="240" w:lineRule="auto"/>
+              <w:jc w:val="center"/>
+              <w:rPr>
+                <w:rFonts w:ascii="Arial" w:eastAsia="Times New Roman" w:hAnsi="Arial" w:cs="Arial"/>
+                <w:bCs/>
+                <w:color w:val="000000"/>
+                <w:sz w:val="20"/>
+                <w:szCs w:val="20"/>
+              </w:rPr>
+            </w:pPr>
+            <w:r>
+              <w:rPr>
+                <w:rFonts w:ascii="Arial" w:eastAsia="Times New Roman" w:hAnsi="Arial" w:cs="Arial"/>
+                <w:bCs/>
+                <w:color w:val="000000"/>
+                <w:sz w:val="20"/>
+                <w:szCs w:val="20"/>
+              </w:rPr>
+              <w:t>47.0 [1.0, 59.0]</w:t>
+            </w:r>
+          </w:p>
+        </w:tc>
+        <w:tc>
+          <w:tcPr>
+            <w:tcW w:w="0" w:type="auto"/>
+            <w:tcBorders>
+              <w:top w:val="nil"/>
+              <w:left w:val="nil"/>
+              <w:bottom w:val="nil"/>
+              <w:right w:val="nil"/>
+            </w:tcBorders>
+            <w:shd w:val="clear" w:color="auto" w:fill="FFFFFF"/>
+            <w:noWrap/>
+            <w:tcMar>
+              <w:top w:w="60" w:type="dxa"/>
+              <w:left w:w="180" w:type="dxa"/>
+              <w:bottom w:w="60" w:type="dxa"/>
+              <w:right w:w="180" w:type="dxa"/>
+            </w:tcMar>
+            <w:vAlign w:val="center"/>
+          </w:tcPr>
+          <w:p>
+            <w:pPr>
+              <w:spacing w:after="0" w:line="240" w:lineRule="auto"/>
+              <w:jc w:val="center"/>
+              <w:rPr>
+                <w:rFonts w:ascii="Arial" w:eastAsia="Times New Roman" w:hAnsi="Arial" w:cs="Arial"/>
+                <w:sz w:val="20"/>
+                <w:szCs w:val="20"/>
+              </w:rPr>
+            </w:pPr>
+            <w:r>
+              <w:rPr>
+                <w:rFonts w:ascii="Arial" w:eastAsia="Times New Roman" w:hAnsi="Arial" w:cs="Arial"/>
+                <w:sz w:val="20"/>
+                <w:szCs w:val="20"/>
+              </w:rPr>
+              <w:t>95.0 [1.0, 209.0]</w:t>
+            </w:r>
+          </w:p>
+        </w:tc>
+        <w:tc>
+          <w:tcPr>
+            <w:tcW w:w="0" w:type="auto"/>
+            <w:tcBorders>
+              <w:top w:val="nil"/>
+              <w:left w:val="nil"/>
+              <w:bottom w:val="nil"/>
+              <w:right w:val="nil"/>
+            </w:tcBorders>
+            <w:shd w:val="clear" w:color="auto" w:fill="FFFFFF"/>
+            <w:noWrap/>
+            <w:tcMar>
+              <w:top w:w="60" w:type="dxa"/>
+              <w:left w:w="180" w:type="dxa"/>
+              <w:bottom w:w="60" w:type="dxa"/>
+              <w:right w:w="180" w:type="dxa"/>
+            </w:tcMar>
+            <w:vAlign w:val="center"/>
+          </w:tcPr>
+          <w:p>
+            <w:pPr>
+              <w:spacing w:after="0" w:line="240" w:lineRule="auto"/>
+              <w:jc w:val="center"/>
+              <w:rPr>
+                <w:rFonts w:ascii="Arial" w:eastAsia="Times New Roman" w:hAnsi="Arial" w:cs="Arial"/>
+                <w:sz w:val="20"/>
+                <w:szCs w:val="20"/>
+              </w:rPr>
+            </w:pPr>
+            <w:r>
+              <w:rPr>
+                <w:rFonts w:ascii="Arial" w:eastAsia="Times New Roman" w:hAnsi="Arial" w:cs="Arial"/>
+                <w:sz w:val="20"/>
+                <w:szCs w:val="20"/>
+              </w:rPr>
+              <w:t>99.0 [1.0, 261.0]</w:t>
+            </w:r>
+          </w:p>
+        </w:tc>
+      </w:tr>
+      <w:tr>
+        <w:tc>
+          <w:tcPr>
+            <w:tcW w:w="0" w:type="auto"/>
+            <w:tcBorders>
+              <w:top w:val="nil"/>
+              <w:left w:val="nil"/>
+              <w:bottom w:val="nil"/>
+              <w:right w:val="nil"/>
+            </w:tcBorders>
+            <w:shd w:val="clear" w:color="auto" w:fill="FFFFFF"/>
+            <w:noWrap/>
+            <w:tcMar>
+              <w:top w:w="60" w:type="dxa"/>
+              <w:left w:w="60" w:type="dxa"/>
+              <w:bottom w:w="60" w:type="dxa"/>
+              <w:right w:w="180" w:type="dxa"/>
+            </w:tcMar>
+            <w:vAlign w:val="center"/>
             <w:hideMark/>
           </w:tcPr>
           <w:p>
@@ -4831,6 +5198,7 @@
                 <w:sz w:val="20"/>
                 <w:szCs w:val="20"/>
               </w:rPr>
+              <w:lastRenderedPageBreak/>
               <w:t>Mean (SD)</w:t>
             </w:r>
           </w:p>
@@ -5169,7 +5537,6 @@
                 <w:sz w:val="20"/>
                 <w:szCs w:val="20"/>
               </w:rPr>
-              <w:lastRenderedPageBreak/>
               <w:t>Missing</w:t>
             </w:r>
           </w:p>
@@ -10011,23 +10378,25 @@
         </w:tc>
       </w:tr>
     </w:tbl>
-    <w:p/>
+    <w:p>
+      <w:r>
+        <w:rPr>
+          <w:vertAlign w:val="superscript"/>
+        </w:rPr>
+        <w:t xml:space="preserve">1 </w:t>
+      </w:r>
+      <w:r>
+        <w:t>Percentages add to more than 100% because some candidates are included in both the training and test sets (ie, non-overlapping follow-up for the same candidate).</w:t>
+      </w:r>
+    </w:p>
     <w:p>
       <w:r>
         <w:br w:type="page"/>
       </w:r>
       <w:r>
         <w:lastRenderedPageBreak/>
-        <w:t xml:space="preserve">Supplemental Table 1: </w:t>
+        <w:t>Supplemental Table 1: Candidate characteristics, by training and test data split, after imputation of missing and out-of-range values.</w:t>
       </w:r>
-      <w:r>
-        <w:t>Candidate characteristics, by training and test data split</w:t>
-      </w:r>
-      <w:r>
-        <w:t>, after imputation of missing and out-of-range values.</w:t>
-      </w:r>
-      <w:bookmarkStart w:id="0" w:name="_GoBack"/>
-      <w:bookmarkEnd w:id="0"/>
     </w:p>
     <w:tbl>
       <w:tblPr>

</xml_diff>